<commit_message>
Update resume: add portfolio URL and correct email
Co-Authored-By: Claude Sonnet 4.6 <noreply@anthropic.com>
</commit_message>
<xml_diff>
--- a/Samarpan_Gorlewar_Resume.docx
+++ b/Samarpan_Gorlewar_Resume.docx
@@ -189,7 +189,7 @@
                 <w:sz w:val="17"/>
                 <w:szCs w:val="17"/>
               </w:rPr>
-              <w:t xml:space="preserve">✉  samarpang.habuild@gmail.com</w:t>
+              <w:t xml:space="preserve">✉  samugorlewar@gmail.com</w:t>
             </w:r>
           </w:p>
         </w:tc>
@@ -221,7 +221,7 @@
                 <w:sz w:val="17"/>
                 <w:szCs w:val="17"/>
               </w:rPr>
-              <w:t xml:space="preserve">🌐 Hindi | Marathi | English</w:t>
+              <w:t xml:space="preserve">🌐 samarpanghabuild-dotcom.github.io/portfolio</w:t>
             </w:r>
           </w:p>
         </w:tc>

</xml_diff>

<commit_message>
Update experience dates across portfolio and resume
- Habuild Healthcare: 2025 – Present (current)
- Medical Representative: 2021 – 2025 (4 years)
- Store Manager: 2020 – 2021 (1 year)

Co-Authored-By: Claude Sonnet 4.6 <noreply@anthropic.com>
</commit_message>
<xml_diff>
--- a/Samarpan_Gorlewar_Resume.docx
+++ b/Samarpan_Gorlewar_Resume.docx
@@ -357,7 +357,7 @@
                 <w:sz w:val="18"/>
                 <w:szCs w:val="18"/>
               </w:rPr>
-              <w:t xml:space="preserve">Jan 2023 – Present  |  1 Year 3 Months</w:t>
+              <w:t xml:space="preserve">2025 – Present  |  Current</w:t>
             </w:r>
           </w:p>
         </w:tc>
@@ -523,7 +523,7 @@
                 <w:sz w:val="18"/>
                 <w:szCs w:val="18"/>
               </w:rPr>
-              <w:t xml:space="preserve">2020 – 2023  |  3 Years</w:t>
+              <w:t xml:space="preserve">2021 – 2025  |  4 Years</w:t>
             </w:r>
           </w:p>
         </w:tc>
@@ -672,7 +672,7 @@
                 <w:sz w:val="18"/>
                 <w:szCs w:val="18"/>
               </w:rPr>
-              <w:t xml:space="preserve">2019 – 2020  |  6 Months</w:t>
+              <w:t xml:space="preserve">2020 – 2021  |  1 Year</w:t>
             </w:r>
           </w:p>
         </w:tc>

</xml_diff>